<commit_message>
"Latest Version after modyfing 5_Feed_Inventory_Controller.py"
</commit_message>
<xml_diff>
--- a/MyHerdApp_12_Module_Manual_Arabic.docx
+++ b/MyHerdApp_12_Module_Manual_Arabic.docx
@@ -6,8 +6,16 @@
       <w:pPr>
         <w:pStyle w:val="Title"/>
         <w:jc w:val="center"/>
+        <w:rPr>
+          <w:sz w:val="56"/>
+          <w:szCs w:val="56"/>
+        </w:rPr>
       </w:pPr>
       <w:r>
+        <w:rPr>
+          <w:sz w:val="56"/>
+          <w:szCs w:val="56"/>
+        </w:rPr>
         <w:t>تطبيق إدارة القطيع (MyHerdApp) - الدليل المرجعي الشامل لـ 12 وحدة</w:t>
       </w:r>
     </w:p>
@@ -15,10 +23,16 @@
       <w:pPr>
         <w:bidi/>
         <w:jc w:val="center"/>
+        <w:rPr>
+          <w:sz w:val="24"/>
+          <w:szCs w:val="24"/>
+        </w:rPr>
       </w:pPr>
       <w:r>
         <w:rPr>
           <w:i/>
+          <w:sz w:val="24"/>
+          <w:szCs w:val="24"/>
         </w:rPr>
         <w:t>دليل سير العمل التشغيلي والإشراف الإداري المتكامل</w:t>
       </w:r>
@@ -27,33 +41,65 @@
       <w:pPr>
         <w:pStyle w:val="Heading1"/>
         <w:bidi/>
+        <w:rPr>
+          <w:sz w:val="32"/>
+          <w:szCs w:val="32"/>
+        </w:rPr>
       </w:pPr>
       <w:proofErr w:type="spellStart"/>
       <w:r>
+        <w:rPr>
+          <w:sz w:val="32"/>
+          <w:szCs w:val="32"/>
+        </w:rPr>
         <w:t>هندسة</w:t>
       </w:r>
       <w:proofErr w:type="spellEnd"/>
       <w:r>
+        <w:rPr>
+          <w:sz w:val="32"/>
+          <w:szCs w:val="32"/>
+        </w:rPr>
         <w:t xml:space="preserve"> </w:t>
       </w:r>
       <w:proofErr w:type="spellStart"/>
       <w:r>
+        <w:rPr>
+          <w:sz w:val="32"/>
+          <w:szCs w:val="32"/>
+        </w:rPr>
         <w:t>النظام</w:t>
       </w:r>
       <w:proofErr w:type="spellEnd"/>
       <w:r>
+        <w:rPr>
+          <w:sz w:val="32"/>
+          <w:szCs w:val="32"/>
+        </w:rPr>
         <w:t xml:space="preserve"> </w:t>
       </w:r>
       <w:proofErr w:type="spellStart"/>
       <w:r>
+        <w:rPr>
+          <w:sz w:val="32"/>
+          <w:szCs w:val="32"/>
+        </w:rPr>
         <w:t>والمرجع</w:t>
       </w:r>
       <w:proofErr w:type="spellEnd"/>
       <w:r>
+        <w:rPr>
+          <w:sz w:val="32"/>
+          <w:szCs w:val="32"/>
+        </w:rPr>
         <w:t xml:space="preserve"> لـ 12 </w:t>
       </w:r>
       <w:proofErr w:type="spellStart"/>
       <w:r>
+        <w:rPr>
+          <w:sz w:val="32"/>
+          <w:szCs w:val="32"/>
+        </w:rPr>
         <w:t>صفحة</w:t>
       </w:r>
       <w:proofErr w:type="spellEnd"/>
@@ -62,11 +108,17 @@
       <w:pPr>
         <w:pStyle w:val="ListBullet"/>
         <w:bidi/>
+        <w:rPr>
+          <w:sz w:val="24"/>
+          <w:szCs w:val="24"/>
+        </w:rPr>
       </w:pPr>
       <w:proofErr w:type="spellStart"/>
       <w:r>
         <w:rPr>
           <w:b/>
+          <w:sz w:val="24"/>
+          <w:szCs w:val="24"/>
         </w:rPr>
         <w:t>الصفحة</w:t>
       </w:r>
@@ -74,6 +126,8 @@
       <w:r>
         <w:rPr>
           <w:b/>
+          <w:sz w:val="24"/>
+          <w:szCs w:val="24"/>
         </w:rPr>
         <w:t xml:space="preserve"> 1: </w:t>
       </w:r>
@@ -81,6 +135,8 @@
       <w:r>
         <w:rPr>
           <w:b/>
+          <w:sz w:val="24"/>
+          <w:szCs w:val="24"/>
         </w:rPr>
         <w:t>البوابة</w:t>
       </w:r>
@@ -88,6 +144,8 @@
       <w:r>
         <w:rPr>
           <w:b/>
+          <w:sz w:val="24"/>
+          <w:szCs w:val="24"/>
         </w:rPr>
         <w:t xml:space="preserve"> </w:t>
       </w:r>
@@ -95,6 +153,8 @@
       <w:r>
         <w:rPr>
           <w:b/>
+          <w:sz w:val="24"/>
+          <w:szCs w:val="24"/>
         </w:rPr>
         <w:t>الرئيسية</w:t>
       </w:r>
@@ -102,19 +162,31 @@
       <w:r>
         <w:rPr>
           <w:b/>
+          <w:sz w:val="24"/>
+          <w:szCs w:val="24"/>
         </w:rPr>
         <w:t xml:space="preserve"> التنفيذية وبوابة المصادقة</w:t>
       </w:r>
       <w:r>
         <w:rPr>
           <w:b/>
+          <w:sz w:val="24"/>
+          <w:szCs w:val="24"/>
         </w:rPr>
         <w:br/>
       </w:r>
       <w:r>
+        <w:rPr>
+          <w:sz w:val="24"/>
+          <w:szCs w:val="24"/>
+        </w:rPr>
         <w:t>تشغيلي: تسجيل دخول آمن للمستخدم، وصول قائم على الأدوار، وتبديل اللغات ثنائي اللغة.</w:t>
       </w:r>
       <w:r>
+        <w:rPr>
+          <w:sz w:val="24"/>
+          <w:szCs w:val="24"/>
+        </w:rPr>
         <w:br/>
         <w:t>إداري: سجلات تدقيق أمان النظام ومراقبة الجلسات النشطة.</w:t>
       </w:r>
@@ -123,23 +195,39 @@
       <w:pPr>
         <w:pStyle w:val="ListBullet"/>
         <w:bidi/>
+        <w:rPr>
+          <w:sz w:val="24"/>
+          <w:szCs w:val="24"/>
+        </w:rPr>
       </w:pPr>
       <w:r>
         <w:rPr>
           <w:b/>
+          <w:sz w:val="24"/>
+          <w:szCs w:val="24"/>
         </w:rPr>
         <w:t>الصفحة 2: سجل القطيع الرئيسي والمخزون</w:t>
       </w:r>
       <w:r>
         <w:rPr>
           <w:b/>
+          <w:sz w:val="24"/>
+          <w:szCs w:val="24"/>
         </w:rPr>
         <w:br/>
       </w:r>
       <w:r>
+        <w:rPr>
+          <w:sz w:val="24"/>
+          <w:szCs w:val="24"/>
+        </w:rPr>
         <w:t>تشغيلي: تتبع الحيوانات الفردية عبر أرقام أوسم فريدة، تصنيف السلالات، وتصفية الحالة.</w:t>
       </w:r>
       <w:r>
+        <w:rPr>
+          <w:sz w:val="24"/>
+          <w:szCs w:val="24"/>
+        </w:rPr>
         <w:br/>
         <w:t>إداري: تقارير تعداد الرأس الإجمالية وملخصات التركيبة السكانية للقطيع.</w:t>
       </w:r>
@@ -148,23 +236,39 @@
       <w:pPr>
         <w:pStyle w:val="ListBullet"/>
         <w:bidi/>
+        <w:rPr>
+          <w:sz w:val="24"/>
+          <w:szCs w:val="24"/>
+        </w:rPr>
       </w:pPr>
       <w:r>
         <w:rPr>
           <w:b/>
+          <w:sz w:val="24"/>
+          <w:szCs w:val="24"/>
         </w:rPr>
         <w:t>الصفحة 3: تتبع الأوزان ونمو الحيوانات</w:t>
       </w:r>
       <w:r>
         <w:rPr>
           <w:b/>
+          <w:sz w:val="24"/>
+          <w:szCs w:val="24"/>
         </w:rPr>
         <w:br/>
       </w:r>
       <w:r>
+        <w:rPr>
+          <w:sz w:val="24"/>
+          <w:szCs w:val="24"/>
+        </w:rPr>
         <w:t>تشغيلي: تسجيل قياسات الموازين الروتينية وتتبع زيادة الوزن الفردية بمرور الوقت.</w:t>
       </w:r>
       <w:r>
+        <w:rPr>
+          <w:sz w:val="24"/>
+          <w:szCs w:val="24"/>
+        </w:rPr>
         <w:br/>
         <w:t>إداري: تحليل منحنيات النمو وتحديد التأخيرات في الأداء.</w:t>
       </w:r>
@@ -173,23 +277,39 @@
       <w:pPr>
         <w:pStyle w:val="ListBullet"/>
         <w:bidi/>
+        <w:rPr>
+          <w:sz w:val="24"/>
+          <w:szCs w:val="24"/>
+        </w:rPr>
       </w:pPr>
       <w:r>
         <w:rPr>
           <w:b/>
+          <w:sz w:val="24"/>
+          <w:szCs w:val="24"/>
         </w:rPr>
         <w:t>الصفحة 4: تركيبة الأعلاف وحاسبة الحصص</w:t>
       </w:r>
       <w:r>
         <w:rPr>
           <w:b/>
+          <w:sz w:val="24"/>
+          <w:szCs w:val="24"/>
         </w:rPr>
         <w:br/>
       </w:r>
       <w:r>
+        <w:rPr>
+          <w:sz w:val="24"/>
+          <w:szCs w:val="24"/>
+        </w:rPr>
         <w:t>تشغيلي: إدخال وصفات الأعلاف اليومية، حساب استهلاك المادة الجافة، وإدارة أنواع خلطات الوصفات.</w:t>
       </w:r>
       <w:r>
+        <w:rPr>
+          <w:sz w:val="24"/>
+          <w:szCs w:val="24"/>
+        </w:rPr>
         <w:br/>
         <w:t>إداري: مراقبة كفاءة تكلفة الأعلاف ومعدلات استهلاك المواد الخام.</w:t>
       </w:r>
@@ -198,23 +318,39 @@
       <w:pPr>
         <w:pStyle w:val="ListBullet"/>
         <w:bidi/>
+        <w:rPr>
+          <w:sz w:val="24"/>
+          <w:szCs w:val="24"/>
+        </w:rPr>
       </w:pPr>
       <w:r>
         <w:rPr>
           <w:b/>
+          <w:sz w:val="24"/>
+          <w:szCs w:val="24"/>
         </w:rPr>
         <w:t>الصفحة 5: سجلات الصحة والبيطرة والعلاج</w:t>
       </w:r>
       <w:r>
         <w:rPr>
           <w:b/>
+          <w:sz w:val="24"/>
+          <w:szCs w:val="24"/>
         </w:rPr>
         <w:br/>
       </w:r>
       <w:r>
+        <w:rPr>
+          <w:sz w:val="24"/>
+          <w:szCs w:val="24"/>
+        </w:rPr>
         <w:t>تشغيلي: تسجيل التطعيمات، إعطاء الأدوية، والفحوصات البيطرية لكل رقم وسم.</w:t>
       </w:r>
       <w:r>
+        <w:rPr>
+          <w:sz w:val="24"/>
+          <w:szCs w:val="24"/>
+        </w:rPr>
         <w:br/>
         <w:t>إداري: تتبع معدلات انتشار الأمراض وتدقيق النفقات الطبية.</w:t>
       </w:r>
@@ -223,23 +359,39 @@
       <w:pPr>
         <w:pStyle w:val="ListBullet"/>
         <w:bidi/>
+        <w:rPr>
+          <w:sz w:val="24"/>
+          <w:szCs w:val="24"/>
+        </w:rPr>
       </w:pPr>
       <w:r>
         <w:rPr>
           <w:b/>
+          <w:sz w:val="24"/>
+          <w:szCs w:val="24"/>
         </w:rPr>
         <w:t>الصفحة 6: سجل التكاثر والتناسل</w:t>
       </w:r>
       <w:r>
         <w:rPr>
           <w:b/>
+          <w:sz w:val="24"/>
+          <w:szCs w:val="24"/>
         </w:rPr>
         <w:br/>
       </w:r>
       <w:r>
+        <w:rPr>
+          <w:sz w:val="24"/>
+          <w:szCs w:val="24"/>
+        </w:rPr>
         <w:t>تشغيلي: تتبع تواريخ التزاوج، فحوصات الحمل، أحداث الولادة، وأحجام البطون.</w:t>
       </w:r>
       <w:r>
+        <w:rPr>
+          <w:sz w:val="24"/>
+          <w:szCs w:val="24"/>
+        </w:rPr>
         <w:br/>
         <w:t>إداري: مقاييس الكفاءة التناسلية ومؤشرات الأداء الرئيسية لإنتاجية القطيع الأساسي.</w:t>
       </w:r>
@@ -248,23 +400,39 @@
       <w:pPr>
         <w:pStyle w:val="ListBullet"/>
         <w:bidi/>
+        <w:rPr>
+          <w:sz w:val="24"/>
+          <w:szCs w:val="24"/>
+        </w:rPr>
       </w:pPr>
       <w:r>
         <w:rPr>
           <w:b/>
+          <w:sz w:val="24"/>
+          <w:szCs w:val="24"/>
         </w:rPr>
         <w:t>الصفحة 7: حيازة المواشي وإعداد رأس المال</w:t>
       </w:r>
       <w:r>
         <w:rPr>
           <w:b/>
+          <w:sz w:val="24"/>
+          <w:szCs w:val="24"/>
         </w:rPr>
         <w:br/>
       </w:r>
       <w:r>
+        <w:rPr>
+          <w:sz w:val="24"/>
+          <w:szCs w:val="24"/>
+        </w:rPr>
         <w:t>تشغيلي: إدراج دفعات الشراء الجديدة مع تفاصيل المصدر، أسعار الشراء، والأوزان الأولية.</w:t>
       </w:r>
       <w:r>
+        <w:rPr>
+          <w:sz w:val="24"/>
+          <w:szCs w:val="24"/>
+        </w:rPr>
         <w:br/>
         <w:t>إداري: تتبع نشر رأس المال وتقييم الأصول الأولية.</w:t>
       </w:r>
@@ -273,23 +441,39 @@
       <w:pPr>
         <w:pStyle w:val="ListBullet"/>
         <w:bidi/>
+        <w:rPr>
+          <w:sz w:val="24"/>
+          <w:szCs w:val="24"/>
+        </w:rPr>
       </w:pPr>
       <w:r>
         <w:rPr>
           <w:b/>
+          <w:sz w:val="24"/>
+          <w:szCs w:val="24"/>
         </w:rPr>
         <w:t>الصفحة 8: المبيعات وتحقيق الإيرادات</w:t>
       </w:r>
       <w:r>
         <w:rPr>
           <w:b/>
+          <w:sz w:val="24"/>
+          <w:szCs w:val="24"/>
         </w:rPr>
         <w:br/>
       </w:r>
       <w:r>
+        <w:rPr>
+          <w:sz w:val="24"/>
+          <w:szCs w:val="24"/>
+        </w:rPr>
         <w:t>تشغيلي: تسجيل مبيعات المواشي، عوائد الصوف، وإيصالات معاملات السوق.</w:t>
       </w:r>
       <w:r>
+        <w:rPr>
+          <w:sz w:val="24"/>
+          <w:szCs w:val="24"/>
+        </w:rPr>
         <w:br/>
         <w:t>إداري: تحليل تدفقات الإيرادات وتحقيق ربحية الدفعات.</w:t>
       </w:r>
@@ -298,23 +482,39 @@
       <w:pPr>
         <w:pStyle w:val="ListBullet"/>
         <w:bidi/>
+        <w:rPr>
+          <w:sz w:val="24"/>
+          <w:szCs w:val="24"/>
+        </w:rPr>
       </w:pPr>
       <w:r>
         <w:rPr>
           <w:b/>
+          <w:sz w:val="24"/>
+          <w:szCs w:val="24"/>
         </w:rPr>
         <w:t>الصفحة 9: المصروفات التشغيلية وتدفقات الأعلاف (OpEx)</w:t>
       </w:r>
       <w:r>
         <w:rPr>
           <w:b/>
+          <w:sz w:val="24"/>
+          <w:szCs w:val="24"/>
         </w:rPr>
         <w:br/>
       </w:r>
       <w:r>
+        <w:rPr>
+          <w:sz w:val="24"/>
+          <w:szCs w:val="24"/>
+        </w:rPr>
         <w:t>تشغيلي: تسجيل تكاليف تشغيل المزرعة اليومية، العمالة، ومشتريات المواد المستهلكة.</w:t>
       </w:r>
       <w:r>
+        <w:rPr>
+          <w:sz w:val="24"/>
+          <w:szCs w:val="24"/>
+        </w:rPr>
         <w:br/>
         <w:t>إداري: تخصيص مراكز التكلفة ومراقبة انحراف الميزانية.</w:t>
       </w:r>
@@ -323,23 +523,39 @@
       <w:pPr>
         <w:pStyle w:val="ListBullet"/>
         <w:bidi/>
+        <w:rPr>
+          <w:sz w:val="24"/>
+          <w:szCs w:val="24"/>
+        </w:rPr>
       </w:pPr>
       <w:r>
         <w:rPr>
           <w:b/>
+          <w:sz w:val="24"/>
+          <w:szCs w:val="24"/>
         </w:rPr>
         <w:t>الصفحة 10: جسر البيانات التشغيلية والتدقيق</w:t>
       </w:r>
       <w:r>
         <w:rPr>
           <w:b/>
+          <w:sz w:val="24"/>
+          <w:szCs w:val="24"/>
         </w:rPr>
         <w:br/>
       </w:r>
       <w:r>
+        <w:rPr>
+          <w:sz w:val="24"/>
+          <w:szCs w:val="24"/>
+        </w:rPr>
         <w:t>تشغيلي: مطابقة السجلات الميدانية غير المتحقق منها ومعالجة تدفقات بيانات الأعلاف التلقائية.</w:t>
       </w:r>
       <w:r>
+        <w:rPr>
+          <w:sz w:val="24"/>
+          <w:szCs w:val="24"/>
+        </w:rPr>
         <w:br/>
         <w:t>إداري: مراجعة كشف الشذوذ (مثل تحذيرات الاستهلاك العالي) قبل الترحيل للدفتر.</w:t>
       </w:r>
@@ -348,23 +564,40 @@
       <w:pPr>
         <w:pStyle w:val="ListBullet"/>
         <w:bidi/>
+        <w:rPr>
+          <w:sz w:val="24"/>
+          <w:szCs w:val="24"/>
+        </w:rPr>
       </w:pPr>
       <w:r>
         <w:rPr>
           <w:b/>
+          <w:sz w:val="24"/>
+          <w:szCs w:val="24"/>
         </w:rPr>
+        <w:lastRenderedPageBreak/>
         <w:t>الصفحة 11: تحليلات الأداء وتكلفة زيادة الوزن</w:t>
       </w:r>
       <w:r>
         <w:rPr>
           <w:b/>
+          <w:sz w:val="24"/>
+          <w:szCs w:val="24"/>
         </w:rPr>
         <w:br/>
       </w:r>
       <w:r>
+        <w:rPr>
+          <w:sz w:val="24"/>
+          <w:szCs w:val="24"/>
+        </w:rPr>
         <w:t>تشغيلي: مراجعة قوائم الأرباح والخسائر على مستوى الدفعات.</w:t>
       </w:r>
       <w:r>
+        <w:rPr>
+          <w:sz w:val="24"/>
+          <w:szCs w:val="24"/>
+        </w:rPr>
         <w:br/>
         <w:t>إداري: تحليل نسب تحويل الأعلاف، تكلفة زيادة الوزن ($/كجم)، ومعايير الكفاءة التشغيلية.</w:t>
       </w:r>
@@ -373,29 +606,45 @@
       <w:pPr>
         <w:pStyle w:val="ListBullet"/>
         <w:bidi/>
+        <w:rPr>
+          <w:sz w:val="24"/>
+          <w:szCs w:val="24"/>
+        </w:rPr>
       </w:pPr>
       <w:r>
         <w:rPr>
           <w:b/>
+          <w:sz w:val="24"/>
+          <w:szCs w:val="24"/>
         </w:rPr>
-        <w:lastRenderedPageBreak/>
         <w:t>الصفحة 12: توقعات التدفق النقدي والتقارير التنفيذية</w:t>
       </w:r>
       <w:r>
         <w:rPr>
           <w:b/>
+          <w:sz w:val="24"/>
+          <w:szCs w:val="24"/>
         </w:rPr>
         <w:br/>
       </w:r>
       <w:r>
+        <w:rPr>
+          <w:sz w:val="24"/>
+          <w:szCs w:val="24"/>
+        </w:rPr>
         <w:t>تشغيلي: إدخال المصروفات المستقبلية المجدولة والمتحصلات المتوقعة.</w:t>
       </w:r>
       <w:r>
+        <w:rPr>
+          <w:sz w:val="24"/>
+          <w:szCs w:val="24"/>
+        </w:rPr>
         <w:br/>
         <w:t>إداري: التنبؤ بالسيولة لـ 90 يوماً والملخصات المالية على مستوى مجلس الإدارة.</w:t>
       </w:r>
     </w:p>
     <w:sectPr>
+      <w:footerReference w:type="default" r:id="rId8"/>
       <w:pgSz w:w="12240" w:h="15840"/>
       <w:pgMar w:top="1440" w:right="1800" w:bottom="1440" w:left="1800" w:header="720" w:footer="720" w:gutter="0"/>
       <w:cols w:space="720"/>
@@ -403,6 +652,184 @@
     </w:sectPr>
   </w:body>
 </w:document>
+</file>
+
+<file path=word/endnotes.xml><?xml version="1.0" encoding="utf-8"?>
+<w:endnotes xmlns:wpc="http://schemas.microsoft.com/office/word/2010/wordprocessingCanvas" xmlns:cx="http://schemas.microsoft.com/office/drawing/2014/chartex" xmlns:cx1="http://schemas.microsoft.com/office/drawing/2015/9/8/chartex" xmlns:cx2="http://schemas.microsoft.com/office/drawing/2015/10/21/chartex" xmlns:cx3="http://schemas.microsoft.com/office/drawing/2016/5/9/chartex" xmlns:cx4="http://schemas.microsoft.com/office/drawing/2016/5/10/chartex" xmlns:cx5="http://schemas.microsoft.com/office/drawing/2016/5/11/chartex" xmlns:cx6="http://schemas.microsoft.com/office/drawing/2016/5/12/chartex" xmlns:cx7="http://schemas.microsoft.com/office/drawing/2016/5/13/chartex" xmlns:cx8="http://schemas.microsoft.com/office/drawing/2016/5/14/chartex" xmlns:mc="http://schemas.openxmlformats.org/markup-compatibility/2006" xmlns:aink="http://schemas.microsoft.com/office/drawing/2016/ink" xmlns:am3d="http://schemas.microsoft.com/office/drawing/2017/model3d" xmlns:o="urn:schemas-microsoft-com:office:office" xmlns:oel="http://schemas.microsoft.com/office/2019/extlst" xmlns:r="http://schemas.openxmlformats.org/officeDocument/2006/relationships" xmlns:m="http://schemas.openxmlformats.org/officeDocument/2006/math" xmlns:v="urn:schemas-microsoft-com:vml" xmlns:wp14="http://schemas.microsoft.com/office/word/2010/wordprocessingDrawing" xmlns:wp="http://schemas.openxmlformats.org/drawingml/2006/wordprocessingDrawing" xmlns:w10="urn:schemas-microsoft-com:office:word" xmlns:w="http://schemas.openxmlformats.org/wordprocessingml/2006/main" xmlns:w14="http://schemas.microsoft.com/office/word/2010/wordml" xmlns:w15="http://schemas.microsoft.com/office/word/2012/wordml" xmlns:w16cex="http://schemas.microsoft.com/office/word/2018/wordml/cex" xmlns:w16cid="http://schemas.microsoft.com/office/word/2016/wordml/cid" xmlns:w16="http://schemas.microsoft.com/office/word/2018/wordml" xmlns:w16du="http://schemas.microsoft.com/office/word/2023/wordml/word16du" xmlns:w16sdtdh="http://schemas.microsoft.com/office/word/2020/wordml/sdtdatahash" xmlns:w16sdtfl="http://schemas.microsoft.com/office/word/2024/wordml/sdtformatlock" xmlns:w16se="http://schemas.microsoft.com/office/word/2015/wordml/symex" xmlns:wpg="http://schemas.microsoft.com/office/word/2010/wordprocessingGroup" xmlns:wpi="http://schemas.microsoft.com/office/word/2010/wordprocessingInk" xmlns:wne="http://schemas.microsoft.com/office/word/2006/wordml" xmlns:wps="http://schemas.microsoft.com/office/word/2010/wordprocessingShape" mc:Ignorable="w14 w15 w16se w16cid w16 w16cex w16sdtdh w16sdtfl w16du wp14">
+  <w:endnote w:type="separator" w:id="-1">
+    <w:p>
+      <w:pPr>
+        <w:spacing w:after="0" w:line="240" w:lineRule="auto"/>
+      </w:pPr>
+      <w:r>
+        <w:separator/>
+      </w:r>
+    </w:p>
+  </w:endnote>
+  <w:endnote w:type="continuationSeparator" w:id="0">
+    <w:p>
+      <w:pPr>
+        <w:spacing w:after="0" w:line="240" w:lineRule="auto"/>
+      </w:pPr>
+      <w:r>
+        <w:continuationSeparator/>
+      </w:r>
+    </w:p>
+  </w:endnote>
+</w:endnotes>
+</file>
+
+<file path=word/footer1.xml><?xml version="1.0" encoding="utf-8"?>
+<w:ftr xmlns:wpc="http://schemas.microsoft.com/office/word/2010/wordprocessingCanvas" xmlns:cx="http://schemas.microsoft.com/office/drawing/2014/chartex" xmlns:cx1="http://schemas.microsoft.com/office/drawing/2015/9/8/chartex" xmlns:cx2="http://schemas.microsoft.com/office/drawing/2015/10/21/chartex" xmlns:cx3="http://schemas.microsoft.com/office/drawing/2016/5/9/chartex" xmlns:cx4="http://schemas.microsoft.com/office/drawing/2016/5/10/chartex" xmlns:cx5="http://schemas.microsoft.com/office/drawing/2016/5/11/chartex" xmlns:cx6="http://schemas.microsoft.com/office/drawing/2016/5/12/chartex" xmlns:cx7="http://schemas.microsoft.com/office/drawing/2016/5/13/chartex" xmlns:cx8="http://schemas.microsoft.com/office/drawing/2016/5/14/chartex" xmlns:mc="http://schemas.openxmlformats.org/markup-compatibility/2006" xmlns:aink="http://schemas.microsoft.com/office/drawing/2016/ink" xmlns:am3d="http://schemas.microsoft.com/office/drawing/2017/model3d" xmlns:o="urn:schemas-microsoft-com:office:office" xmlns:oel="http://schemas.microsoft.com/office/2019/extlst" xmlns:r="http://schemas.openxmlformats.org/officeDocument/2006/relationships" xmlns:m="http://schemas.openxmlformats.org/officeDocument/2006/math" xmlns:v="urn:schemas-microsoft-com:vml" xmlns:wp14="http://schemas.microsoft.com/office/word/2010/wordprocessingDrawing" xmlns:wp="http://schemas.openxmlformats.org/drawingml/2006/wordprocessingDrawing" xmlns:w10="urn:schemas-microsoft-com:office:word" xmlns:w="http://schemas.openxmlformats.org/wordprocessingml/2006/main" xmlns:w14="http://schemas.microsoft.com/office/word/2010/wordml" xmlns:w15="http://schemas.microsoft.com/office/word/2012/wordml" xmlns:w16cex="http://schemas.microsoft.com/office/word/2018/wordml/cex" xmlns:w16cid="http://schemas.microsoft.com/office/word/2016/wordml/cid" xmlns:w16="http://schemas.microsoft.com/office/word/2018/wordml" xmlns:w16du="http://schemas.microsoft.com/office/word/2023/wordml/word16du" xmlns:w16sdtdh="http://schemas.microsoft.com/office/word/2020/wordml/sdtdatahash" xmlns:w16sdtfl="http://schemas.microsoft.com/office/word/2024/wordml/sdtformatlock" xmlns:w16se="http://schemas.microsoft.com/office/word/2015/wordml/symex" xmlns:wpg="http://schemas.microsoft.com/office/word/2010/wordprocessingGroup" xmlns:wpi="http://schemas.microsoft.com/office/word/2010/wordprocessingInk" xmlns:wne="http://schemas.microsoft.com/office/word/2006/wordml" xmlns:wps="http://schemas.microsoft.com/office/word/2010/wordprocessingShape" mc:Ignorable="w14 w15 w16se w16cid w16 w16cex w16sdtdh w16sdtfl w16du wp14">
+  <w:sdt>
+    <w:sdtPr>
+      <w:id w:val="1429622797"/>
+      <w:docPartObj>
+        <w:docPartGallery w:val="Page Numbers (Bottom of Page)"/>
+        <w:docPartUnique/>
+      </w:docPartObj>
+    </w:sdtPr>
+    <w:sdtContent>
+      <w:sdt>
+        <w:sdtPr>
+          <w:id w:val="-1769616900"/>
+          <w:docPartObj>
+            <w:docPartGallery w:val="Page Numbers (Top of Page)"/>
+            <w:docPartUnique/>
+          </w:docPartObj>
+        </w:sdtPr>
+        <w:sdtContent>
+          <w:p>
+            <w:pPr>
+              <w:pStyle w:val="Footer"/>
+              <w:jc w:val="right"/>
+            </w:pPr>
+            <w:r>
+              <w:t xml:space="preserve">Page </w:t>
+            </w:r>
+            <w:r>
+              <w:rPr>
+                <w:b/>
+                <w:bCs/>
+                <w:sz w:val="24"/>
+                <w:szCs w:val="24"/>
+              </w:rPr>
+              <w:fldChar w:fldCharType="begin"/>
+            </w:r>
+            <w:r>
+              <w:rPr>
+                <w:b/>
+                <w:bCs/>
+              </w:rPr>
+              <w:instrText xml:space="preserve"> PAGE </w:instrText>
+            </w:r>
+            <w:r>
+              <w:rPr>
+                <w:b/>
+                <w:bCs/>
+                <w:sz w:val="24"/>
+                <w:szCs w:val="24"/>
+              </w:rPr>
+              <w:fldChar w:fldCharType="separate"/>
+            </w:r>
+            <w:r>
+              <w:rPr>
+                <w:b/>
+                <w:bCs/>
+                <w:noProof/>
+              </w:rPr>
+              <w:t>2</w:t>
+            </w:r>
+            <w:r>
+              <w:rPr>
+                <w:b/>
+                <w:bCs/>
+                <w:sz w:val="24"/>
+                <w:szCs w:val="24"/>
+              </w:rPr>
+              <w:fldChar w:fldCharType="end"/>
+            </w:r>
+            <w:r>
+              <w:t xml:space="preserve"> of </w:t>
+            </w:r>
+            <w:r>
+              <w:rPr>
+                <w:b/>
+                <w:bCs/>
+                <w:sz w:val="24"/>
+                <w:szCs w:val="24"/>
+              </w:rPr>
+              <w:fldChar w:fldCharType="begin"/>
+            </w:r>
+            <w:r>
+              <w:rPr>
+                <w:b/>
+                <w:bCs/>
+              </w:rPr>
+              <w:instrText xml:space="preserve"> NUMPAGES  </w:instrText>
+            </w:r>
+            <w:r>
+              <w:rPr>
+                <w:b/>
+                <w:bCs/>
+                <w:sz w:val="24"/>
+                <w:szCs w:val="24"/>
+              </w:rPr>
+              <w:fldChar w:fldCharType="separate"/>
+            </w:r>
+            <w:r>
+              <w:rPr>
+                <w:b/>
+                <w:bCs/>
+                <w:noProof/>
+              </w:rPr>
+              <w:t>2</w:t>
+            </w:r>
+            <w:r>
+              <w:rPr>
+                <w:b/>
+                <w:bCs/>
+                <w:sz w:val="24"/>
+                <w:szCs w:val="24"/>
+              </w:rPr>
+              <w:fldChar w:fldCharType="end"/>
+            </w:r>
+          </w:p>
+        </w:sdtContent>
+      </w:sdt>
+    </w:sdtContent>
+  </w:sdt>
+  <w:p>
+    <w:pPr>
+      <w:pStyle w:val="Footer"/>
+    </w:pPr>
+  </w:p>
+</w:ftr>
+</file>
+
+<file path=word/footnotes.xml><?xml version="1.0" encoding="utf-8"?>
+<w:footnotes xmlns:wpc="http://schemas.microsoft.com/office/word/2010/wordprocessingCanvas" xmlns:cx="http://schemas.microsoft.com/office/drawing/2014/chartex" xmlns:cx1="http://schemas.microsoft.com/office/drawing/2015/9/8/chartex" xmlns:cx2="http://schemas.microsoft.com/office/drawing/2015/10/21/chartex" xmlns:cx3="http://schemas.microsoft.com/office/drawing/2016/5/9/chartex" xmlns:cx4="http://schemas.microsoft.com/office/drawing/2016/5/10/chartex" xmlns:cx5="http://schemas.microsoft.com/office/drawing/2016/5/11/chartex" xmlns:cx6="http://schemas.microsoft.com/office/drawing/2016/5/12/chartex" xmlns:cx7="http://schemas.microsoft.com/office/drawing/2016/5/13/chartex" xmlns:cx8="http://schemas.microsoft.com/office/drawing/2016/5/14/chartex" xmlns:mc="http://schemas.openxmlformats.org/markup-compatibility/2006" xmlns:aink="http://schemas.microsoft.com/office/drawing/2016/ink" xmlns:am3d="http://schemas.microsoft.com/office/drawing/2017/model3d" xmlns:o="urn:schemas-microsoft-com:office:office" xmlns:oel="http://schemas.microsoft.com/office/2019/extlst" xmlns:r="http://schemas.openxmlformats.org/officeDocument/2006/relationships" xmlns:m="http://schemas.openxmlformats.org/officeDocument/2006/math" xmlns:v="urn:schemas-microsoft-com:vml" xmlns:wp14="http://schemas.microsoft.com/office/word/2010/wordprocessingDrawing" xmlns:wp="http://schemas.openxmlformats.org/drawingml/2006/wordprocessingDrawing" xmlns:w10="urn:schemas-microsoft-com:office:word" xmlns:w="http://schemas.openxmlformats.org/wordprocessingml/2006/main" xmlns:w14="http://schemas.microsoft.com/office/word/2010/wordml" xmlns:w15="http://schemas.microsoft.com/office/word/2012/wordml" xmlns:w16cex="http://schemas.microsoft.com/office/word/2018/wordml/cex" xmlns:w16cid="http://schemas.microsoft.com/office/word/2016/wordml/cid" xmlns:w16="http://schemas.microsoft.com/office/word/2018/wordml" xmlns:w16du="http://schemas.microsoft.com/office/word/2023/wordml/word16du" xmlns:w16sdtdh="http://schemas.microsoft.com/office/word/2020/wordml/sdtdatahash" xmlns:w16sdtfl="http://schemas.microsoft.com/office/word/2024/wordml/sdtformatlock" xmlns:w16se="http://schemas.microsoft.com/office/word/2015/wordml/symex" xmlns:wpg="http://schemas.microsoft.com/office/word/2010/wordprocessingGroup" xmlns:wpi="http://schemas.microsoft.com/office/word/2010/wordprocessingInk" xmlns:wne="http://schemas.microsoft.com/office/word/2006/wordml" xmlns:wps="http://schemas.microsoft.com/office/word/2010/wordprocessingShape" mc:Ignorable="w14 w15 w16se w16cid w16 w16cex w16sdtdh w16sdtfl w16du wp14">
+  <w:footnote w:type="separator" w:id="-1">
+    <w:p>
+      <w:pPr>
+        <w:spacing w:after="0" w:line="240" w:lineRule="auto"/>
+      </w:pPr>
+      <w:r>
+        <w:separator/>
+      </w:r>
+    </w:p>
+  </w:footnote>
+  <w:footnote w:type="continuationSeparator" w:id="0">
+    <w:p>
+      <w:pPr>
+        <w:spacing w:after="0" w:line="240" w:lineRule="auto"/>
+      </w:pPr>
+      <w:r>
+        <w:continuationSeparator/>
+      </w:r>
+    </w:p>
+  </w:footnote>
+</w:footnotes>
 </file>
 
 <file path=word/numbering.xml><?xml version="1.0" encoding="utf-8"?>

</xml_diff>